<commit_message>
docs: 操作手册更新至 Ver.2610300122（21 页）
新增与修订：
- 6.3 翻译选项补充「同时翻译文件名」；6.5 输出规则补充译名规则与输出目录不可写自动转存
- 新增 7.2 视图切换（逐段对照/全文预览）与 7.3 显示设置（效果五选/译文字体/分布方式），
  原 7.2~7.4 顺延为 7.4~7.6
- 2.2 补充程序目录不可写时降级到 LOCALAPPDATA 的说明
- 8.4 缓存与运行补充配置文件位置、导出配置、导入配置、固化为出厂默认
- 新增 10.2 配置随软件分发（配置加载优先级四层表、两种迁移方式、EXE 自修改限制说明、
  DPAPI 仅本机可用说明）；10.1 目录结构补充「出厂配置.json」
- FAQ 新增 5 条（写回失败、启动 Access denied、换机配置、固化失败、全文预览慢）
- 修复编号列表跨章节连续累加（改为手动编号，每组从 1 开始）
- 重截 07/12/13 三张截图，删除过时的 09；插图编号理顺为 6-2、8-3
</commit_message>
<xml_diff>
--- a/manual/Gururu 翻译 操作手册.docx
+++ b/manual/Gururu 翻译 操作手册.docx
@@ -124,7 +124,7 @@
           <w:b/>
           <w:sz w:val="22"/>
         </w:rPr>
-        <w:t>Gurutu2610292129</w:t>
+        <w:t>Ver.2610300122</w:t>
       </w:r>
     </w:p>
     <w:p>
@@ -147,7 +147,7 @@
           <w:b/>
           <w:sz w:val="22"/>
         </w:rPr>
-        <w:t>2026-10-29 21:29</w:t>
+        <w:t>2026-10-30 01:22</w:t>
       </w:r>
     </w:p>
     <w:p>
@@ -193,7 +193,7 @@
           <w:b/>
           <w:sz w:val="22"/>
         </w:rPr>
-        <w:t>2026-10-29</w:t>
+        <w:t>2026-10-30</w:t>
       </w:r>
     </w:p>
     <w:p>
@@ -397,7 +397,7 @@
           <w:sz w:val="21"/>
         </w:rPr>
         <w:tab/>
-        <w:t>10</w:t>
+        <w:t>11</w:t>
       </w:r>
     </w:p>
     <w:p>
@@ -423,7 +423,7 @@
           <w:sz w:val="21"/>
         </w:rPr>
         <w:tab/>
-        <w:t>12</w:t>
+        <w:t>14</w:t>
       </w:r>
     </w:p>
     <w:p>
@@ -449,7 +449,7 @@
           <w:sz w:val="21"/>
         </w:rPr>
         <w:tab/>
-        <w:t>14</w:t>
+        <w:t>16</w:t>
       </w:r>
     </w:p>
     <w:p>
@@ -475,7 +475,7 @@
           <w:sz w:val="21"/>
         </w:rPr>
         <w:tab/>
-        <w:t>14</w:t>
+        <w:t>17</w:t>
       </w:r>
     </w:p>
     <w:p>
@@ -501,7 +501,7 @@
           <w:sz w:val="21"/>
         </w:rPr>
         <w:tab/>
-        <w:t>15</w:t>
+        <w:t>18</w:t>
       </w:r>
     </w:p>
     <w:p>
@@ -527,7 +527,7 @@
           <w:sz w:val="21"/>
         </w:rPr>
         <w:tab/>
-        <w:t>16</w:t>
+        <w:t>20</w:t>
       </w:r>
     </w:p>
     <w:p>
@@ -1619,6 +1619,32 @@
     </w:p>
     <w:p>
       <w:pPr>
+        <w:spacing w:before="80" w:after="160" w:line="348" w:lineRule="auto"/>
+        <w:ind w:left="170"/>
+        <w:pBdr>
+          <w:left w:val="single" w:sz="18" w:space="8" w:color="1F66D8"/>
+        </w:pBdr>
+      </w:pPr>
+      <w:r>
+        <w:rPr>
+          <w:rFonts w:ascii="Segoe UI" w:hAnsi="Segoe UI" w:eastAsia="微软雅黑"/>
+          <w:b/>
+          <w:color w:val="1F66D8"/>
+          <w:sz w:val="20"/>
+        </w:rPr>
+        <w:t>【注意】</w:t>
+      </w:r>
+      <w:r>
+        <w:rPr>
+          <w:rFonts w:ascii="Segoe UI" w:hAnsi="Segoe UI" w:eastAsia="微软雅黑"/>
+          <w:b w:val="0"/>
+          <w:sz w:val="20"/>
+        </w:rPr>
+        <w:t>若程序目录不可写（例如放在 Program Files），程序会自动把 data 与 output 转存到 %LOCALAPPDATA%\Gururu 翻译\，仍可正常启动；设置 → 缓存与运行中的「数据目录」会显示实际位置。如需「配置随软件走」，请把软件移到普通可写目录。</w:t>
+      </w:r>
+    </w:p>
+    <w:p>
+      <w:pPr>
         <w:keepNext/>
         <w:spacing w:before="240" w:after="100"/>
       </w:pPr>
@@ -2902,9 +2928,17 @@
     </w:p>
     <w:p>
       <w:pPr>
-        <w:pStyle w:val="ListNumber"/>
         <w:spacing w:after="60" w:line="348" w:lineRule="auto"/>
-      </w:pPr>
+        <w:ind w:left="482" w:hanging="482"/>
+      </w:pPr>
+      <w:r>
+        <w:rPr>
+          <w:rFonts w:ascii="Segoe UI" w:hAnsi="Segoe UI" w:eastAsia="微软雅黑"/>
+          <w:b/>
+          <w:sz w:val="21"/>
+        </w:rPr>
+        <w:t xml:space="preserve">1. </w:t>
+      </w:r>
       <w:r>
         <w:rPr>
           <w:rFonts w:ascii="Segoe UI" w:hAnsi="Segoe UI" w:eastAsia="微软雅黑"/>
@@ -2916,9 +2950,17 @@
     </w:p>
     <w:p>
       <w:pPr>
-        <w:pStyle w:val="ListNumber"/>
         <w:spacing w:after="60" w:line="348" w:lineRule="auto"/>
-      </w:pPr>
+        <w:ind w:left="482" w:hanging="482"/>
+      </w:pPr>
+      <w:r>
+        <w:rPr>
+          <w:rFonts w:ascii="Segoe UI" w:hAnsi="Segoe UI" w:eastAsia="微软雅黑"/>
+          <w:b/>
+          <w:sz w:val="21"/>
+        </w:rPr>
+        <w:t xml:space="preserve">2. </w:t>
+      </w:r>
       <w:r>
         <w:rPr>
           <w:rFonts w:ascii="Segoe UI" w:hAnsi="Segoe UI" w:eastAsia="微软雅黑"/>
@@ -2930,9 +2972,17 @@
     </w:p>
     <w:p>
       <w:pPr>
-        <w:pStyle w:val="ListNumber"/>
         <w:spacing w:after="60" w:line="348" w:lineRule="auto"/>
-      </w:pPr>
+        <w:ind w:left="482" w:hanging="482"/>
+      </w:pPr>
+      <w:r>
+        <w:rPr>
+          <w:rFonts w:ascii="Segoe UI" w:hAnsi="Segoe UI" w:eastAsia="微软雅黑"/>
+          <w:b/>
+          <w:sz w:val="21"/>
+        </w:rPr>
+        <w:t xml:space="preserve">3. </w:t>
+      </w:r>
       <w:r>
         <w:rPr>
           <w:rFonts w:ascii="Segoe UI" w:hAnsi="Segoe UI" w:eastAsia="微软雅黑"/>
@@ -2944,9 +2994,17 @@
     </w:p>
     <w:p>
       <w:pPr>
-        <w:pStyle w:val="ListNumber"/>
         <w:spacing w:after="60" w:line="348" w:lineRule="auto"/>
-      </w:pPr>
+        <w:ind w:left="482" w:hanging="482"/>
+      </w:pPr>
+      <w:r>
+        <w:rPr>
+          <w:rFonts w:ascii="Segoe UI" w:hAnsi="Segoe UI" w:eastAsia="微软雅黑"/>
+          <w:b/>
+          <w:sz w:val="21"/>
+        </w:rPr>
+        <w:t xml:space="preserve">4. </w:t>
+      </w:r>
       <w:r>
         <w:rPr>
           <w:rFonts w:ascii="Segoe UI" w:hAnsi="Segoe UI" w:eastAsia="微软雅黑"/>
@@ -4444,6 +4502,49 @@
                 <w:b w:val="0"/>
                 <w:sz w:val="19"/>
               </w:rPr>
+              <w:t>同时翻译文件名</w:t>
+            </w:r>
+          </w:p>
+        </w:tc>
+        <w:tc>
+          <w:tcPr>
+            <w:tcW w:type="dxa" w:w="6350"/>
+          </w:tcPr>
+          <w:p>
+            <w:pPr>
+              <w:spacing w:after="40"/>
+            </w:pPr>
+            <w:r/>
+            <w:r>
+              <w:rPr>
+                <w:rFonts w:ascii="Segoe UI" w:hAnsi="Segoe UI" w:eastAsia="微软雅黑"/>
+                <w:b w:val="0"/>
+                <w:sz w:val="19"/>
+              </w:rPr>
+              <w:t>勾选后输出文件直接使用译名（英文自动词首大写、非法字符自动清理）；此时设置 → 常规中的「输出文件名后缀」自动置灰失效</w:t>
+            </w:r>
+          </w:p>
+        </w:tc>
+      </w:tr>
+      <w:tr>
+        <w:trPr>
+          <w:cantSplit/>
+        </w:trPr>
+        <w:tc>
+          <w:tcPr>
+            <w:tcW w:type="dxa" w:w="2268"/>
+          </w:tcPr>
+          <w:p>
+            <w:pPr>
+              <w:spacing w:after="40"/>
+            </w:pPr>
+            <w:r/>
+            <w:r>
+              <w:rPr>
+                <w:rFonts w:ascii="Segoe UI" w:hAnsi="Segoe UI" w:eastAsia="微软雅黑"/>
+                <w:b w:val="0"/>
+                <w:sz w:val="19"/>
+              </w:rPr>
               <w:t>完成后自动输出译文</w:t>
             </w:r>
           </w:p>
@@ -4519,145 +4620,6 @@
     </w:p>
     <w:p>
       <w:pPr>
-        <w:keepNext/>
-        <w:spacing w:before="240" w:after="100"/>
-      </w:pPr>
-      <w:r>
-        <w:rPr>
-          <w:rFonts w:ascii="Segoe UI" w:hAnsi="Segoe UI" w:eastAsia="微软雅黑"/>
-          <w:b/>
-          <w:sz w:val="25"/>
-        </w:rPr>
-        <w:t>6.4  队列与状态</w:t>
-      </w:r>
-    </w:p>
-    <w:p>
-      <w:pPr>
-        <w:spacing w:after="120" w:line="360" w:lineRule="auto"/>
-      </w:pPr>
-      <w:r>
-        <w:rPr>
-          <w:rFonts w:ascii="Segoe UI" w:hAnsi="Segoe UI" w:eastAsia="微软雅黑"/>
-          <w:b w:val="0"/>
-          <w:sz w:val="21"/>
-        </w:rPr>
-        <w:t>每行显示文件名、扩展名、实时进度、段数与操作按钮。状态含义：</w:t>
-      </w:r>
-    </w:p>
-    <w:p>
-      <w:pPr>
-        <w:pStyle w:val="ListBullet"/>
-        <w:spacing w:after="60" w:line="348" w:lineRule="auto"/>
-      </w:pPr>
-      <w:r>
-        <w:rPr>
-          <w:rFonts w:ascii="Segoe UI" w:hAnsi="Segoe UI" w:eastAsia="微软雅黑"/>
-          <w:b w:val="0"/>
-          <w:sz w:val="21"/>
-        </w:rPr>
-        <w:t>排队 / 处理中 / 完成 / 失败 / 已取消，失败行会给出错误摘要</w:t>
-      </w:r>
-    </w:p>
-    <w:p>
-      <w:pPr>
-        <w:pStyle w:val="ListBullet"/>
-        <w:spacing w:after="60" w:line="348" w:lineRule="auto"/>
-      </w:pPr>
-      <w:r>
-        <w:rPr>
-          <w:rFonts w:ascii="Segoe UI" w:hAnsi="Segoe UI" w:eastAsia="微软雅黑"/>
-          <w:b w:val="0"/>
-          <w:sz w:val="21"/>
-        </w:rPr>
-        <w:t>完成后出现「✎」预览调整与「↗」打开译文；「×」将文件移出队列</w:t>
-      </w:r>
-    </w:p>
-    <w:p>
-      <w:pPr>
-        <w:spacing w:after="120" w:line="360" w:lineRule="auto"/>
-      </w:pPr>
-      <w:r>
-        <w:rPr>
-          <w:rFonts w:ascii="Segoe UI" w:hAnsi="Segoe UI" w:eastAsia="微软雅黑"/>
-          <w:b w:val="0"/>
-          <w:sz w:val="21"/>
-        </w:rPr>
-        <w:t>底部按钮：开始翻译、取消（正在进行的任务）、添加文件夹、清理已完成。</w:t>
-      </w:r>
-    </w:p>
-    <w:p>
-      <w:pPr>
-        <w:keepNext/>
-        <w:spacing w:before="240" w:after="100"/>
-      </w:pPr>
-      <w:r>
-        <w:rPr>
-          <w:rFonts w:ascii="Segoe UI" w:hAnsi="Segoe UI" w:eastAsia="微软雅黑"/>
-          <w:b/>
-          <w:sz w:val="25"/>
-        </w:rPr>
-        <w:t>6.5  输出规则</w:t>
-      </w:r>
-    </w:p>
-    <w:p>
-      <w:pPr>
-        <w:spacing w:after="120" w:line="360" w:lineRule="auto"/>
-      </w:pPr>
-      <w:r>
-        <w:rPr>
-          <w:rFonts w:ascii="Segoe UI" w:hAnsi="Segoe UI" w:eastAsia="微软雅黑"/>
-          <w:b w:val="0"/>
-          <w:sz w:val="21"/>
-        </w:rPr>
-        <w:t>输出文件默认写入设置中的输出目录，文件名追加「_译文」后缀，例如 「技术服务合同.docx」→「技术服务合同_译文.docx」。同名文件会被覆盖。</w:t>
-      </w:r>
-    </w:p>
-    <w:p>
-      <w:pPr>
-        <w:spacing w:before="320" w:after="160"/>
-        <w:pBdr>
-          <w:bottom w:val="single" w:sz="6" w:space="4" w:color="1F66D8"/>
-        </w:pBdr>
-      </w:pPr>
-      <w:r>
-        <w:rPr>
-          <w:rFonts w:ascii="Segoe UI" w:hAnsi="Segoe UI" w:eastAsia="微软雅黑"/>
-          <w:b/>
-          <w:color w:val="1F66D8"/>
-          <w:sz w:val="32"/>
-        </w:rPr>
-        <w:t>7  预览与 AI 调整</w:t>
-      </w:r>
-    </w:p>
-    <w:p>
-      <w:pPr>
-        <w:keepNext/>
-        <w:spacing w:before="240" w:after="100"/>
-      </w:pPr>
-      <w:r>
-        <w:rPr>
-          <w:rFonts w:ascii="Segoe UI" w:hAnsi="Segoe UI" w:eastAsia="微软雅黑"/>
-          <w:b/>
-          <w:sz w:val="25"/>
-        </w:rPr>
-        <w:t>7.1  打开预览</w:t>
-      </w:r>
-    </w:p>
-    <w:p>
-      <w:pPr>
-        <w:spacing w:after="120" w:line="360" w:lineRule="auto"/>
-      </w:pPr>
-      <w:r>
-        <w:rPr>
-          <w:rFonts w:ascii="Segoe UI" w:hAnsi="Segoe UI" w:eastAsia="微软雅黑"/>
-          <w:b w:val="0"/>
-          <w:sz w:val="21"/>
-        </w:rPr>
-        <w:t>翻译完成后点击队列行的「✎」进入预览。左栏为原文（只读），右栏为译文（可直接编辑）。</w:t>
-      </w:r>
-    </w:p>
-    <w:p>
-      <w:pPr>
         <w:spacing w:before="120" w:after="40"/>
         <w:jc w:val="center"/>
       </w:pPr>
@@ -4673,7 +4635,7 @@
               <a:graphicData uri="http://schemas.openxmlformats.org/drawingml/2006/picture">
                 <pic:pic>
                   <pic:nvPicPr>
-                    <pic:cNvPr id="0" name="05-preview.png"/>
+                    <pic:cNvPr id="0" name="11-docs-transname.png"/>
                     <pic:cNvPicPr/>
                   </pic:nvPicPr>
                   <pic:blipFill>
@@ -4708,7 +4670,7 @@
           <w:color w:val="6B7280"/>
           <w:sz w:val="18"/>
         </w:rPr>
-        <w:t>图 7-1  预览调整：逐段对照与底部 AI 指令栏</w:t>
+        <w:t>图 6-2  文档翻译页：翻译选项中的「同时翻译文件名」</w:t>
       </w:r>
     </w:p>
     <w:p>
@@ -4722,13 +4684,12 @@
           <w:b/>
           <w:sz w:val="25"/>
         </w:rPr>
-        <w:t>7.2  逐段修改与全部重译</w:t>
+        <w:t>6.4  队列与状态</w:t>
       </w:r>
     </w:p>
     <w:p>
       <w:pPr>
-        <w:pStyle w:val="ListBullet"/>
-        <w:spacing w:after="60" w:line="348" w:lineRule="auto"/>
+        <w:spacing w:after="120" w:line="360" w:lineRule="auto"/>
       </w:pPr>
       <w:r>
         <w:rPr>
@@ -4736,7 +4697,7 @@
           <w:b w:val="0"/>
           <w:sz w:val="21"/>
         </w:rPr>
-        <w:t>在右栏直接修改文字，改动即时写回内存；被修改的段落状态点变为蓝色</w:t>
+        <w:t>每行显示文件名、扩展名、实时进度、段数与操作按钮。状态含义：</w:t>
       </w:r>
     </w:p>
     <w:p>
@@ -4750,7 +4711,34 @@
           <w:b w:val="0"/>
           <w:sz w:val="21"/>
         </w:rPr>
-        <w:t>切换风格或术语库后点「全部重译」，可整篇重译，已手动修改的段落会被保留</w:t>
+        <w:t>排队 / 处理中 / 完成 / 失败 / 已取消，失败行会给出错误摘要</w:t>
+      </w:r>
+    </w:p>
+    <w:p>
+      <w:pPr>
+        <w:pStyle w:val="ListBullet"/>
+        <w:spacing w:after="60" w:line="348" w:lineRule="auto"/>
+      </w:pPr>
+      <w:r>
+        <w:rPr>
+          <w:rFonts w:ascii="Segoe UI" w:hAnsi="Segoe UI" w:eastAsia="微软雅黑"/>
+          <w:b w:val="0"/>
+          <w:sz w:val="21"/>
+        </w:rPr>
+        <w:t>完成后出现「✎」预览调整与「↗」打开译文；「×」将文件移出队列</w:t>
+      </w:r>
+    </w:p>
+    <w:p>
+      <w:pPr>
+        <w:spacing w:after="120" w:line="360" w:lineRule="auto"/>
+      </w:pPr>
+      <w:r>
+        <w:rPr>
+          <w:rFonts w:ascii="Segoe UI" w:hAnsi="Segoe UI" w:eastAsia="微软雅黑"/>
+          <w:b w:val="0"/>
+          <w:sz w:val="21"/>
+        </w:rPr>
+        <w:t>底部按钮：开始翻译、取消（正在进行的任务）、添加文件夹、清理已完成。</w:t>
       </w:r>
     </w:p>
     <w:p>
@@ -4764,7 +4752,7 @@
           <w:b/>
           <w:sz w:val="25"/>
         </w:rPr>
-        <w:t>7.3  AI 调整</w:t>
+        <w:t>6.5  输出规则</w:t>
       </w:r>
     </w:p>
     <w:p>
@@ -4777,13 +4765,12 @@
           <w:b w:val="0"/>
           <w:sz w:val="21"/>
         </w:rPr>
-        <w:t>需先在设置中配置大模型 API Key。用法：</w:t>
+        <w:t>输出文件默认写入设置中的输出目录，文件名追加「_译文」后缀，例如 「技术服务合同.docx」→「技术服务合同_译文.docx」。同名文件会被覆盖。</w:t>
       </w:r>
     </w:p>
     <w:p>
       <w:pPr>
-        <w:pStyle w:val="ListNumber"/>
-        <w:spacing w:after="60" w:line="348" w:lineRule="auto"/>
+        <w:spacing w:after="120" w:line="360" w:lineRule="auto"/>
       </w:pPr>
       <w:r>
         <w:rPr>
@@ -4791,75 +4778,33 @@
           <w:b w:val="0"/>
           <w:sz w:val="21"/>
         </w:rPr>
-        <w:t>点击左栏原文可选中该段落（再点一次取消），不选则作用于全部。</w:t>
+        <w:t>勾选「同时翻译文件名」后，输出直接使用译名而不再追加后缀，例如 「季度财务报告.docx」→「Quarterly Financial Report.docx」；译名中的 \ / : * ? " &lt; &gt; | 等非法字符会被自动清理，超过 80 字会截断。</w:t>
       </w:r>
     </w:p>
     <w:p>
       <w:pPr>
-        <w:pStyle w:val="ListNumber"/>
-        <w:spacing w:after="60" w:line="348" w:lineRule="auto"/>
-      </w:pPr>
+        <w:spacing w:before="80" w:after="160" w:line="348" w:lineRule="auto"/>
+        <w:ind w:left="170"/>
+        <w:pBdr>
+          <w:left w:val="single" w:sz="18" w:space="8" w:color="1F66D8"/>
+        </w:pBdr>
+      </w:pPr>
+      <w:r>
+        <w:rPr>
+          <w:rFonts w:ascii="Segoe UI" w:hAnsi="Segoe UI" w:eastAsia="微软雅黑"/>
+          <w:b/>
+          <w:color w:val="1F66D8"/>
+          <w:sz w:val="20"/>
+        </w:rPr>
+        <w:t>【注意】</w:t>
+      </w:r>
       <w:r>
         <w:rPr>
           <w:rFonts w:ascii="Segoe UI" w:hAnsi="Segoe UI" w:eastAsia="微软雅黑"/>
           <w:b w:val="0"/>
-          <w:sz w:val="21"/>
+          <w:sz w:val="20"/>
         </w:rPr>
-        <w:t>在底部指令框写明要求，例如「更正式一些」「压缩到原句一半」「统一把接口改称 API」。</w:t>
-      </w:r>
-    </w:p>
-    <w:p>
-      <w:pPr>
-        <w:pStyle w:val="ListNumber"/>
-        <w:spacing w:after="60" w:line="348" w:lineRule="auto"/>
-      </w:pPr>
-      <w:r>
-        <w:rPr>
-          <w:rFonts w:ascii="Segoe UI" w:hAnsi="Segoe UI" w:eastAsia="微软雅黑"/>
-          <w:b w:val="0"/>
-          <w:sz w:val="21"/>
-        </w:rPr>
-        <w:t>点「AI 调整」或按回车，仅将受影响段落送模型，返回后原地刷新。</w:t>
-      </w:r>
-    </w:p>
-    <w:p>
-      <w:pPr>
-        <w:spacing w:after="120" w:line="360" w:lineRule="auto"/>
-      </w:pPr>
-      <w:r>
-        <w:rPr>
-          <w:rFonts w:ascii="Segoe UI" w:hAnsi="Segoe UI" w:eastAsia="微软雅黑"/>
-          <w:b w:val="0"/>
-          <w:sz w:val="21"/>
-        </w:rPr>
-        <w:t>被 AI 改写的段落状态点变为紫色，统计行显示「AI 润色 N」。</w:t>
-      </w:r>
-    </w:p>
-    <w:p>
-      <w:pPr>
-        <w:keepNext/>
-        <w:spacing w:before="240" w:after="100"/>
-      </w:pPr>
-      <w:r>
-        <w:rPr>
-          <w:rFonts w:ascii="Segoe UI" w:hAnsi="Segoe UI" w:eastAsia="微软雅黑"/>
-          <w:b/>
-          <w:sz w:val="25"/>
-        </w:rPr>
-        <w:t>7.4  保存输出</w:t>
-      </w:r>
-    </w:p>
-    <w:p>
-      <w:pPr>
-        <w:spacing w:after="120" w:line="360" w:lineRule="auto"/>
-      </w:pPr>
-      <w:r>
-        <w:rPr>
-          <w:rFonts w:ascii="Segoe UI" w:hAnsi="Segoe UI" w:eastAsia="微软雅黑"/>
-          <w:b w:val="0"/>
-          <w:sz w:val="21"/>
-        </w:rPr>
-        <w:t>顶部可切换输出模式，点「保存输出」按当前设置重写文件。预览中的修改、AI 调整结果都会写入，不会丢失。</w:t>
+        <w:t>输出目录不可写时（例如指向 Program Files），程序会自动把译文转存到默认输出目录，并在任务行的警告中提示实际保存位置，不会丢失翻译结果。</w:t>
       </w:r>
     </w:p>
     <w:p>
@@ -4876,7 +4821,21 @@
           <w:color w:val="1F66D8"/>
           <w:sz w:val="32"/>
         </w:rPr>
-        <w:t>8  设置详解</w:t>
+        <w:t>7  预览与 AI 调整</w:t>
+      </w:r>
+    </w:p>
+    <w:p>
+      <w:pPr>
+        <w:keepNext/>
+        <w:spacing w:before="240" w:after="100"/>
+      </w:pPr>
+      <w:r>
+        <w:rPr>
+          <w:rFonts w:ascii="Segoe UI" w:hAnsi="Segoe UI" w:eastAsia="微软雅黑"/>
+          <w:b/>
+          <w:sz w:val="25"/>
+        </w:rPr>
+        <w:t>7.1  打开预览</w:t>
       </w:r>
     </w:p>
     <w:p>
@@ -4889,7 +4848,7 @@
           <w:b w:val="0"/>
           <w:sz w:val="21"/>
         </w:rPr>
-        <w:t>设置页固定两列卡片，同行等高；「保存设置」按钮固定在右下角，滚动时始终可见。</w:t>
+        <w:t>翻译完成后点击队列行的「✎」进入预览。左栏为原文（只读），右栏为译文（可直接编辑）。</w:t>
       </w:r>
     </w:p>
     <w:p>
@@ -4909,11 +4868,800 @@
               <a:graphicData uri="http://schemas.openxmlformats.org/drawingml/2006/picture">
                 <pic:pic>
                   <pic:nvPicPr>
+                    <pic:cNvPr id="0" name="05-preview.png"/>
+                    <pic:cNvPicPr/>
+                  </pic:nvPicPr>
+                  <pic:blipFill>
+                    <a:blip r:embed="rId16"/>
+                    <a:stretch>
+                      <a:fillRect/>
+                    </a:stretch>
+                  </pic:blipFill>
+                  <pic:spPr>
+                    <a:xfrm>
+                      <a:off x="0" y="0"/>
+                      <a:ext cx="5472000" cy="3588197"/>
+                    </a:xfrm>
+                    <a:prstGeom prst="rect"/>
+                  </pic:spPr>
+                </pic:pic>
+              </a:graphicData>
+            </a:graphic>
+          </wp:inline>
+        </w:drawing>
+      </w:r>
+    </w:p>
+    <w:p>
+      <w:pPr>
+        <w:spacing w:after="200"/>
+        <w:jc w:val="center"/>
+      </w:pPr>
+      <w:r>
+        <w:rPr>
+          <w:rFonts w:ascii="Segoe UI" w:hAnsi="Segoe UI" w:eastAsia="微软雅黑"/>
+          <w:b w:val="0"/>
+          <w:color w:val="6B7280"/>
+          <w:sz w:val="18"/>
+        </w:rPr>
+        <w:t>图 7-1  预览调整：逐段对照与底部 AI 指令栏</w:t>
+      </w:r>
+    </w:p>
+    <w:p>
+      <w:pPr>
+        <w:keepNext/>
+        <w:spacing w:before="240" w:after="100"/>
+      </w:pPr>
+      <w:r>
+        <w:rPr>
+          <w:rFonts w:ascii="Segoe UI" w:hAnsi="Segoe UI" w:eastAsia="微软雅黑"/>
+          <w:b/>
+          <w:sz w:val="25"/>
+        </w:rPr>
+        <w:t>7.2  视图切换：逐段对照 / 全文预览</w:t>
+      </w:r>
+    </w:p>
+    <w:p>
+      <w:pPr>
+        <w:spacing w:after="120" w:line="360" w:lineRule="auto"/>
+      </w:pPr>
+      <w:r>
+        <w:rPr>
+          <w:rFonts w:ascii="Segoe UI" w:hAnsi="Segoe UI" w:eastAsia="微软雅黑"/>
+          <w:b w:val="0"/>
+          <w:sz w:val="21"/>
+        </w:rPr>
+        <w:t>预览页顶部提供两种视图，随时可切换，改动在两种视图间实时同步：</w:t>
+      </w:r>
+    </w:p>
+    <w:tbl>
+      <w:tblPr>
+        <w:tblStyle w:val="TableGrid"/>
+        <w:tblW w:type="auto" w:w="0"/>
+        <w:jc w:val="center"/>
+        <w:tblLayout w:type="fixed"/>
+        <w:tblLook w:firstColumn="1" w:firstRow="1" w:lastColumn="0" w:lastRow="0" w:noHBand="0" w:noVBand="1" w:val="04A0"/>
+      </w:tblPr>
+      <w:tblGrid>
+        <w:gridCol w:w="1928"/>
+        <w:gridCol w:w="6690"/>
+      </w:tblGrid>
+      <w:tr>
+        <w:tc>
+          <w:tcPr>
+            <w:tcW w:type="dxa" w:w="1928"/>
+            <w:shd w:fill="EEF3FB"/>
+          </w:tcPr>
+          <w:p>
+            <w:pPr>
+              <w:keepNext/>
+              <w:spacing w:after="40"/>
+            </w:pPr>
+            <w:r/>
+            <w:r>
+              <w:rPr>
+                <w:rFonts w:ascii="Segoe UI" w:hAnsi="Segoe UI" w:eastAsia="微软雅黑"/>
+                <w:b/>
+                <w:sz w:val="19"/>
+              </w:rPr>
+              <w:t>视图</w:t>
+            </w:r>
+          </w:p>
+        </w:tc>
+        <w:tc>
+          <w:tcPr>
+            <w:tcW w:type="dxa" w:w="6690"/>
+            <w:shd w:fill="EEF3FB"/>
+          </w:tcPr>
+          <w:p>
+            <w:pPr>
+              <w:keepNext/>
+              <w:spacing w:after="40"/>
+            </w:pPr>
+            <w:r/>
+            <w:r>
+              <w:rPr>
+                <w:rFonts w:ascii="Segoe UI" w:hAnsi="Segoe UI" w:eastAsia="微软雅黑"/>
+                <w:b/>
+                <w:sz w:val="19"/>
+              </w:rPr>
+              <w:t>用途与特点</w:t>
+            </w:r>
+          </w:p>
+        </w:tc>
+      </w:tr>
+      <w:tr>
+        <w:trPr>
+          <w:cantSplit/>
+        </w:trPr>
+        <w:tc>
+          <w:tcPr>
+            <w:tcW w:type="dxa" w:w="1928"/>
+          </w:tcPr>
+          <w:p>
+            <w:pPr>
+              <w:spacing w:after="40"/>
+            </w:pPr>
+            <w:r/>
+            <w:r>
+              <w:rPr>
+                <w:rFonts w:ascii="Segoe UI" w:hAnsi="Segoe UI" w:eastAsia="微软雅黑"/>
+                <w:b w:val="0"/>
+                <w:sz w:val="19"/>
+              </w:rPr>
+              <w:t>逐段对照</w:t>
+            </w:r>
+          </w:p>
+        </w:tc>
+        <w:tc>
+          <w:tcPr>
+            <w:tcW w:type="dxa" w:w="6690"/>
+          </w:tcPr>
+          <w:p>
+            <w:pPr>
+              <w:spacing w:after="40"/>
+            </w:pPr>
+            <w:r/>
+            <w:r>
+              <w:rPr>
+                <w:rFonts w:ascii="Segoe UI" w:hAnsi="Segoe UI" w:eastAsia="微软雅黑"/>
+                <w:b w:val="0"/>
+                <w:sz w:val="19"/>
+              </w:rPr>
+              <w:t>左栏原文、右栏译文逐段并列，适合逐句校对与精细修改</w:t>
+            </w:r>
+          </w:p>
+        </w:tc>
+      </w:tr>
+      <w:tr>
+        <w:trPr>
+          <w:cantSplit/>
+        </w:trPr>
+        <w:tc>
+          <w:tcPr>
+            <w:tcW w:type="dxa" w:w="1928"/>
+          </w:tcPr>
+          <w:p>
+            <w:pPr>
+              <w:spacing w:after="40"/>
+            </w:pPr>
+            <w:r/>
+            <w:r>
+              <w:rPr>
+                <w:rFonts w:ascii="Segoe UI" w:hAnsi="Segoe UI" w:eastAsia="微软雅黑"/>
+                <w:b w:val="0"/>
+                <w:sz w:val="19"/>
+              </w:rPr>
+              <w:t>全文预览</w:t>
+            </w:r>
+          </w:p>
+        </w:tc>
+        <w:tc>
+          <w:tcPr>
+            <w:tcW w:type="dxa" w:w="6690"/>
+          </w:tcPr>
+          <w:p>
+            <w:pPr>
+              <w:spacing w:after="40"/>
+            </w:pPr>
+            <w:r/>
+            <w:r>
+              <w:rPr>
+                <w:rFonts w:ascii="Segoe UI" w:hAnsi="Segoe UI" w:eastAsia="微软雅黑"/>
+                <w:b w:val="0"/>
+                <w:sz w:val="19"/>
+              </w:rPr>
+              <w:t>按幻灯片页 / PDF 页 / Excel 工作表分组，以连续文档流通篇呈现，适合查看整体版式与段落分布；译文同样可直接编辑</w:t>
+            </w:r>
+          </w:p>
+        </w:tc>
+      </w:tr>
+    </w:tbl>
+    <w:p>
+      <w:pPr>
+        <w:spacing w:after="40"/>
+      </w:pPr>
+    </w:p>
+    <w:p>
+      <w:pPr>
+        <w:spacing w:before="120" w:after="40"/>
+        <w:jc w:val="center"/>
+      </w:pPr>
+      <w:r>
+        <w:drawing>
+          <wp:inline xmlns:a="http://schemas.openxmlformats.org/drawingml/2006/main" xmlns:pic="http://schemas.openxmlformats.org/drawingml/2006/picture">
+            <wp:extent cx="5472000" cy="3588197"/>
+            <wp:docPr id="9" name="Picture 9"/>
+            <wp:cNvGraphicFramePr>
+              <a:graphicFrameLocks noChangeAspect="1"/>
+            </wp:cNvGraphicFramePr>
+            <a:graphic>
+              <a:graphicData uri="http://schemas.openxmlformats.org/drawingml/2006/picture">
+                <pic:pic>
+                  <pic:nvPicPr>
+                    <pic:cNvPr id="0" name="10-preview-full.png"/>
+                    <pic:cNvPicPr/>
+                  </pic:nvPicPr>
+                  <pic:blipFill>
+                    <a:blip r:embed="rId17"/>
+                    <a:stretch>
+                      <a:fillRect/>
+                    </a:stretch>
+                  </pic:blipFill>
+                  <pic:spPr>
+                    <a:xfrm>
+                      <a:off x="0" y="0"/>
+                      <a:ext cx="5472000" cy="3588197"/>
+                    </a:xfrm>
+                    <a:prstGeom prst="rect"/>
+                  </pic:spPr>
+                </pic:pic>
+              </a:graphicData>
+            </a:graphic>
+          </wp:inline>
+        </w:drawing>
+      </w:r>
+    </w:p>
+    <w:p>
+      <w:pPr>
+        <w:spacing w:after="200"/>
+        <w:jc w:val="center"/>
+      </w:pPr>
+      <w:r>
+        <w:rPr>
+          <w:rFonts w:ascii="Segoe UI" w:hAnsi="Segoe UI" w:eastAsia="微软雅黑"/>
+          <w:b w:val="0"/>
+          <w:color w:val="6B7280"/>
+          <w:sz w:val="18"/>
+        </w:rPr>
+        <w:t>图 7-2  全文预览：通篇查看译文布局</w:t>
+      </w:r>
+    </w:p>
+    <w:p>
+      <w:pPr>
+        <w:keepNext/>
+        <w:spacing w:before="240" w:after="100"/>
+      </w:pPr>
+      <w:r>
+        <w:rPr>
+          <w:rFonts w:ascii="Segoe UI" w:hAnsi="Segoe UI" w:eastAsia="微软雅黑"/>
+          <w:b/>
+          <w:sz w:val="25"/>
+        </w:rPr>
+        <w:t>7.3  显示设置（全文预览）</w:t>
+      </w:r>
+    </w:p>
+    <w:p>
+      <w:pPr>
+        <w:spacing w:after="120" w:line="360" w:lineRule="auto"/>
+      </w:pPr>
+      <w:r>
+        <w:rPr>
+          <w:rFonts w:ascii="Segoe UI" w:hAnsi="Segoe UI" w:eastAsia="微软雅黑"/>
+          <w:b w:val="0"/>
+          <w:sz w:val="21"/>
+        </w:rPr>
+        <w:t>全文预览模式下点顶部「显示设置」可调整呈现方式，三项设置会自动记住，下次打开保持：</w:t>
+      </w:r>
+    </w:p>
+    <w:tbl>
+      <w:tblPr>
+        <w:tblStyle w:val="TableGrid"/>
+        <w:tblW w:type="auto" w:w="0"/>
+        <w:jc w:val="center"/>
+        <w:tblLayout w:type="fixed"/>
+        <w:tblLook w:firstColumn="1" w:firstRow="1" w:lastColumn="0" w:lastRow="0" w:noHBand="0" w:noVBand="1" w:val="04A0"/>
+      </w:tblPr>
+      <w:tblGrid>
+        <w:gridCol w:w="1928"/>
+        <w:gridCol w:w="6690"/>
+      </w:tblGrid>
+      <w:tr>
+        <w:tc>
+          <w:tcPr>
+            <w:tcW w:type="dxa" w:w="1928"/>
+            <w:shd w:fill="EEF3FB"/>
+          </w:tcPr>
+          <w:p>
+            <w:pPr>
+              <w:keepNext/>
+              <w:spacing w:after="40"/>
+            </w:pPr>
+            <w:r/>
+            <w:r>
+              <w:rPr>
+                <w:rFonts w:ascii="Segoe UI" w:hAnsi="Segoe UI" w:eastAsia="微软雅黑"/>
+                <w:b/>
+                <w:sz w:val="19"/>
+              </w:rPr>
+              <w:t>设置项</w:t>
+            </w:r>
+          </w:p>
+        </w:tc>
+        <w:tc>
+          <w:tcPr>
+            <w:tcW w:type="dxa" w:w="6690"/>
+            <w:shd w:fill="EEF3FB"/>
+          </w:tcPr>
+          <w:p>
+            <w:pPr>
+              <w:keepNext/>
+              <w:spacing w:after="40"/>
+            </w:pPr>
+            <w:r/>
+            <w:r>
+              <w:rPr>
+                <w:rFonts w:ascii="Segoe UI" w:hAnsi="Segoe UI" w:eastAsia="微软雅黑"/>
+                <w:b/>
+                <w:sz w:val="19"/>
+              </w:rPr>
+              <w:t>可选值与效果</w:t>
+            </w:r>
+          </w:p>
+        </w:tc>
+      </w:tr>
+      <w:tr>
+        <w:trPr>
+          <w:cantSplit/>
+        </w:trPr>
+        <w:tc>
+          <w:tcPr>
+            <w:tcW w:type="dxa" w:w="1928"/>
+          </w:tcPr>
+          <w:p>
+            <w:pPr>
+              <w:spacing w:after="40"/>
+            </w:pPr>
+            <w:r/>
+            <w:r>
+              <w:rPr>
+                <w:rFonts w:ascii="Segoe UI" w:hAnsi="Segoe UI" w:eastAsia="微软雅黑"/>
+                <w:b w:val="0"/>
+                <w:sz w:val="19"/>
+              </w:rPr>
+              <w:t>显示效果</w:t>
+            </w:r>
+          </w:p>
+        </w:tc>
+        <w:tc>
+          <w:tcPr>
+            <w:tcW w:type="dxa" w:w="6690"/>
+          </w:tcPr>
+          <w:p>
+            <w:pPr>
+              <w:spacing w:after="40"/>
+            </w:pPr>
+            <w:r/>
+            <w:r>
+              <w:rPr>
+                <w:rFonts w:ascii="Segoe UI" w:hAnsi="Segoe UI" w:eastAsia="微软雅黑"/>
+                <w:b w:val="0"/>
+                <w:sz w:val="19"/>
+              </w:rPr>
+              <w:t>默认 / 高亮（译文加底色）/ 分割线（译文上方虚线）/ 引用（左侧竖线）/ 模糊（弱化原文、突出译文）。仅作用于译文，每项都带实时示例</w:t>
+            </w:r>
+          </w:p>
+        </w:tc>
+      </w:tr>
+      <w:tr>
+        <w:trPr>
+          <w:cantSplit/>
+        </w:trPr>
+        <w:tc>
+          <w:tcPr>
+            <w:tcW w:type="dxa" w:w="1928"/>
+          </w:tcPr>
+          <w:p>
+            <w:pPr>
+              <w:spacing w:after="40"/>
+            </w:pPr>
+            <w:r/>
+            <w:r>
+              <w:rPr>
+                <w:rFonts w:ascii="Segoe UI" w:hAnsi="Segoe UI" w:eastAsia="微软雅黑"/>
+                <w:b w:val="0"/>
+                <w:sz w:val="19"/>
+              </w:rPr>
+              <w:t>译文字体</w:t>
+            </w:r>
+          </w:p>
+        </w:tc>
+        <w:tc>
+          <w:tcPr>
+            <w:tcW w:type="dxa" w:w="6690"/>
+          </w:tcPr>
+          <w:p>
+            <w:pPr>
+              <w:spacing w:after="40"/>
+            </w:pPr>
+            <w:r/>
+            <w:r>
+              <w:rPr>
+                <w:rFonts w:ascii="Segoe UI" w:hAnsi="Segoe UI" w:eastAsia="微软雅黑"/>
+                <w:b w:val="0"/>
+                <w:sz w:val="19"/>
+              </w:rPr>
+              <w:t>默认、微软雅黑、宋体、黑体、楷体、仿宋、Times New Roman、Arial、Calibri、Georgia</w:t>
+            </w:r>
+          </w:p>
+        </w:tc>
+      </w:tr>
+      <w:tr>
+        <w:trPr>
+          <w:cantSplit/>
+        </w:trPr>
+        <w:tc>
+          <w:tcPr>
+            <w:tcW w:type="dxa" w:w="1928"/>
+          </w:tcPr>
+          <w:p>
+            <w:pPr>
+              <w:spacing w:after="40"/>
+            </w:pPr>
+            <w:r/>
+            <w:r>
+              <w:rPr>
+                <w:rFonts w:ascii="Segoe UI" w:hAnsi="Segoe UI" w:eastAsia="微软雅黑"/>
+                <w:b w:val="0"/>
+                <w:sz w:val="19"/>
+              </w:rPr>
+              <w:t>分布方式</w:t>
+            </w:r>
+          </w:p>
+        </w:tc>
+        <w:tc>
+          <w:tcPr>
+            <w:tcW w:type="dxa" w:w="6690"/>
+          </w:tcPr>
+          <w:p>
+            <w:pPr>
+              <w:spacing w:after="40"/>
+            </w:pPr>
+            <w:r/>
+            <w:r>
+              <w:rPr>
+                <w:rFonts w:ascii="Segoe UI" w:hAnsi="Segoe UI" w:eastAsia="微软雅黑"/>
+                <w:b w:val="0"/>
+                <w:sz w:val="19"/>
+              </w:rPr>
+              <w:t>上下同段（原文在上、译文在下）/ 左右对照（原文左栏、译文右栏）</w:t>
+            </w:r>
+          </w:p>
+        </w:tc>
+      </w:tr>
+    </w:tbl>
+    <w:p>
+      <w:pPr>
+        <w:spacing w:after="40"/>
+      </w:pPr>
+    </w:p>
+    <w:p>
+      <w:pPr>
+        <w:spacing w:before="120" w:after="40"/>
+        <w:jc w:val="center"/>
+      </w:pPr>
+      <w:r>
+        <w:drawing>
+          <wp:inline xmlns:a="http://schemas.openxmlformats.org/drawingml/2006/main" xmlns:pic="http://schemas.openxmlformats.org/drawingml/2006/picture">
+            <wp:extent cx="5472000" cy="3588197"/>
+            <wp:docPr id="10" name="Picture 10"/>
+            <wp:cNvGraphicFramePr>
+              <a:graphicFrameLocks noChangeAspect="1"/>
+            </wp:cNvGraphicFramePr>
+            <a:graphic>
+              <a:graphicData uri="http://schemas.openxmlformats.org/drawingml/2006/picture">
+                <pic:pic>
+                  <pic:nvPicPr>
+                    <pic:cNvPr id="0" name="12-pv-display-settings.png"/>
+                    <pic:cNvPicPr/>
+                  </pic:nvPicPr>
+                  <pic:blipFill>
+                    <a:blip r:embed="rId18"/>
+                    <a:stretch>
+                      <a:fillRect/>
+                    </a:stretch>
+                  </pic:blipFill>
+                  <pic:spPr>
+                    <a:xfrm>
+                      <a:off x="0" y="0"/>
+                      <a:ext cx="5472000" cy="3588197"/>
+                    </a:xfrm>
+                    <a:prstGeom prst="rect"/>
+                  </pic:spPr>
+                </pic:pic>
+              </a:graphicData>
+            </a:graphic>
+          </wp:inline>
+        </w:drawing>
+      </w:r>
+    </w:p>
+    <w:p>
+      <w:pPr>
+        <w:spacing w:after="200"/>
+        <w:jc w:val="center"/>
+      </w:pPr>
+      <w:r>
+        <w:rPr>
+          <w:rFonts w:ascii="Segoe UI" w:hAnsi="Segoe UI" w:eastAsia="微软雅黑"/>
+          <w:b w:val="0"/>
+          <w:color w:val="6B7280"/>
+          <w:sz w:val="18"/>
+        </w:rPr>
+        <w:t>图 7-3  显示设置面板：效果、字体与分布方式</w:t>
+      </w:r>
+    </w:p>
+    <w:p>
+      <w:pPr>
+        <w:spacing w:before="80" w:after="160" w:line="348" w:lineRule="auto"/>
+        <w:ind w:left="170"/>
+        <w:pBdr>
+          <w:left w:val="single" w:sz="18" w:space="8" w:color="1F66D8"/>
+        </w:pBdr>
+      </w:pPr>
+      <w:r>
+        <w:rPr>
+          <w:rFonts w:ascii="Segoe UI" w:hAnsi="Segoe UI" w:eastAsia="微软雅黑"/>
+          <w:b/>
+          <w:color w:val="1F66D8"/>
+          <w:sz w:val="20"/>
+        </w:rPr>
+        <w:t>【建议】</w:t>
+      </w:r>
+      <w:r>
+        <w:rPr>
+          <w:rFonts w:ascii="Segoe UI" w:hAnsi="Segoe UI" w:eastAsia="微软雅黑"/>
+          <w:b w:val="0"/>
+          <w:sz w:val="20"/>
+        </w:rPr>
+        <w:t>超长文档（上千段）在全文预览下为一次性渲染，打开可能变慢；此时切回「逐段对照」编辑即可。</w:t>
+      </w:r>
+    </w:p>
+    <w:p>
+      <w:pPr>
+        <w:keepNext/>
+        <w:spacing w:before="240" w:after="100"/>
+      </w:pPr>
+      <w:r>
+        <w:rPr>
+          <w:rFonts w:ascii="Segoe UI" w:hAnsi="Segoe UI" w:eastAsia="微软雅黑"/>
+          <w:b/>
+          <w:sz w:val="25"/>
+        </w:rPr>
+        <w:t>7.4  逐段修改与全部重译</w:t>
+      </w:r>
+    </w:p>
+    <w:p>
+      <w:pPr>
+        <w:pStyle w:val="ListBullet"/>
+        <w:spacing w:after="60" w:line="348" w:lineRule="auto"/>
+      </w:pPr>
+      <w:r>
+        <w:rPr>
+          <w:rFonts w:ascii="Segoe UI" w:hAnsi="Segoe UI" w:eastAsia="微软雅黑"/>
+          <w:b w:val="0"/>
+          <w:sz w:val="21"/>
+        </w:rPr>
+        <w:t>在右栏直接修改文字，改动即时写回内存；被修改的段落状态点变为蓝色</w:t>
+      </w:r>
+    </w:p>
+    <w:p>
+      <w:pPr>
+        <w:pStyle w:val="ListBullet"/>
+        <w:spacing w:after="60" w:line="348" w:lineRule="auto"/>
+      </w:pPr>
+      <w:r>
+        <w:rPr>
+          <w:rFonts w:ascii="Segoe UI" w:hAnsi="Segoe UI" w:eastAsia="微软雅黑"/>
+          <w:b w:val="0"/>
+          <w:sz w:val="21"/>
+        </w:rPr>
+        <w:t>切换风格或术语库后点「全部重译」，可整篇重译，已手动修改的段落会被保留</w:t>
+      </w:r>
+    </w:p>
+    <w:p>
+      <w:pPr>
+        <w:keepNext/>
+        <w:spacing w:before="240" w:after="100"/>
+      </w:pPr>
+      <w:r>
+        <w:rPr>
+          <w:rFonts w:ascii="Segoe UI" w:hAnsi="Segoe UI" w:eastAsia="微软雅黑"/>
+          <w:b/>
+          <w:sz w:val="25"/>
+        </w:rPr>
+        <w:t>7.5  AI 调整</w:t>
+      </w:r>
+    </w:p>
+    <w:p>
+      <w:pPr>
+        <w:spacing w:after="120" w:line="360" w:lineRule="auto"/>
+      </w:pPr>
+      <w:r>
+        <w:rPr>
+          <w:rFonts w:ascii="Segoe UI" w:hAnsi="Segoe UI" w:eastAsia="微软雅黑"/>
+          <w:b w:val="0"/>
+          <w:sz w:val="21"/>
+        </w:rPr>
+        <w:t>需先在设置中配置大模型 API Key。用法：</w:t>
+      </w:r>
+    </w:p>
+    <w:p>
+      <w:pPr>
+        <w:spacing w:after="60" w:line="348" w:lineRule="auto"/>
+        <w:ind w:left="482" w:hanging="482"/>
+      </w:pPr>
+      <w:r>
+        <w:rPr>
+          <w:rFonts w:ascii="Segoe UI" w:hAnsi="Segoe UI" w:eastAsia="微软雅黑"/>
+          <w:b/>
+          <w:sz w:val="21"/>
+        </w:rPr>
+        <w:t xml:space="preserve">1. </w:t>
+      </w:r>
+      <w:r>
+        <w:rPr>
+          <w:rFonts w:ascii="Segoe UI" w:hAnsi="Segoe UI" w:eastAsia="微软雅黑"/>
+          <w:b w:val="0"/>
+          <w:sz w:val="21"/>
+        </w:rPr>
+        <w:t>点击左栏原文可选中该段落（再点一次取消），不选则作用于全部。</w:t>
+      </w:r>
+    </w:p>
+    <w:p>
+      <w:pPr>
+        <w:spacing w:after="60" w:line="348" w:lineRule="auto"/>
+        <w:ind w:left="482" w:hanging="482"/>
+      </w:pPr>
+      <w:r>
+        <w:rPr>
+          <w:rFonts w:ascii="Segoe UI" w:hAnsi="Segoe UI" w:eastAsia="微软雅黑"/>
+          <w:b/>
+          <w:sz w:val="21"/>
+        </w:rPr>
+        <w:t xml:space="preserve">2. </w:t>
+      </w:r>
+      <w:r>
+        <w:rPr>
+          <w:rFonts w:ascii="Segoe UI" w:hAnsi="Segoe UI" w:eastAsia="微软雅黑"/>
+          <w:b w:val="0"/>
+          <w:sz w:val="21"/>
+        </w:rPr>
+        <w:t>在底部指令框写明要求，例如「更正式一些」「压缩到原句一半」「统一把接口改称 API」。</w:t>
+      </w:r>
+    </w:p>
+    <w:p>
+      <w:pPr>
+        <w:spacing w:after="60" w:line="348" w:lineRule="auto"/>
+        <w:ind w:left="482" w:hanging="482"/>
+      </w:pPr>
+      <w:r>
+        <w:rPr>
+          <w:rFonts w:ascii="Segoe UI" w:hAnsi="Segoe UI" w:eastAsia="微软雅黑"/>
+          <w:b/>
+          <w:sz w:val="21"/>
+        </w:rPr>
+        <w:t xml:space="preserve">3. </w:t>
+      </w:r>
+      <w:r>
+        <w:rPr>
+          <w:rFonts w:ascii="Segoe UI" w:hAnsi="Segoe UI" w:eastAsia="微软雅黑"/>
+          <w:b w:val="0"/>
+          <w:sz w:val="21"/>
+        </w:rPr>
+        <w:t>点「AI 调整」或按回车，仅将受影响段落送模型，返回后原地刷新。</w:t>
+      </w:r>
+    </w:p>
+    <w:p>
+      <w:pPr>
+        <w:spacing w:after="120" w:line="360" w:lineRule="auto"/>
+      </w:pPr>
+      <w:r>
+        <w:rPr>
+          <w:rFonts w:ascii="Segoe UI" w:hAnsi="Segoe UI" w:eastAsia="微软雅黑"/>
+          <w:b w:val="0"/>
+          <w:sz w:val="21"/>
+        </w:rPr>
+        <w:t>被 AI 改写的段落状态点变为紫色，统计行显示「AI 润色 N」。</w:t>
+      </w:r>
+    </w:p>
+    <w:p>
+      <w:pPr>
+        <w:keepNext/>
+        <w:spacing w:before="240" w:after="100"/>
+      </w:pPr>
+      <w:r>
+        <w:rPr>
+          <w:rFonts w:ascii="Segoe UI" w:hAnsi="Segoe UI" w:eastAsia="微软雅黑"/>
+          <w:b/>
+          <w:sz w:val="25"/>
+        </w:rPr>
+        <w:t>7.6  保存输出</w:t>
+      </w:r>
+    </w:p>
+    <w:p>
+      <w:pPr>
+        <w:spacing w:after="120" w:line="360" w:lineRule="auto"/>
+      </w:pPr>
+      <w:r>
+        <w:rPr>
+          <w:rFonts w:ascii="Segoe UI" w:hAnsi="Segoe UI" w:eastAsia="微软雅黑"/>
+          <w:b w:val="0"/>
+          <w:sz w:val="21"/>
+        </w:rPr>
+        <w:t>顶部可切换输出模式，点「保存输出」按当前设置重写文件。预览中的修改、AI 调整结果都会写入，不会丢失。</w:t>
+      </w:r>
+    </w:p>
+    <w:p>
+      <w:pPr>
+        <w:spacing w:before="320" w:after="160"/>
+        <w:pBdr>
+          <w:bottom w:val="single" w:sz="6" w:space="4" w:color="1F66D8"/>
+        </w:pBdr>
+      </w:pPr>
+      <w:r>
+        <w:rPr>
+          <w:rFonts w:ascii="Segoe UI" w:hAnsi="Segoe UI" w:eastAsia="微软雅黑"/>
+          <w:b/>
+          <w:color w:val="1F66D8"/>
+          <w:sz w:val="32"/>
+        </w:rPr>
+        <w:t>8  设置详解</w:t>
+      </w:r>
+    </w:p>
+    <w:p>
+      <w:pPr>
+        <w:spacing w:after="120" w:line="360" w:lineRule="auto"/>
+      </w:pPr>
+      <w:r>
+        <w:rPr>
+          <w:rFonts w:ascii="Segoe UI" w:hAnsi="Segoe UI" w:eastAsia="微软雅黑"/>
+          <w:b w:val="0"/>
+          <w:sz w:val="21"/>
+        </w:rPr>
+        <w:t>设置页固定两列卡片，同行等高；「保存设置」按钮固定在右下角，滚动时始终可见。</w:t>
+      </w:r>
+    </w:p>
+    <w:p>
+      <w:pPr>
+        <w:spacing w:before="120" w:after="40"/>
+        <w:jc w:val="center"/>
+      </w:pPr>
+      <w:r>
+        <w:drawing>
+          <wp:inline xmlns:a="http://schemas.openxmlformats.org/drawingml/2006/main" xmlns:pic="http://schemas.openxmlformats.org/drawingml/2006/picture">
+            <wp:extent cx="5472000" cy="3588197"/>
+            <wp:docPr id="11" name="Picture 11"/>
+            <wp:cNvGraphicFramePr>
+              <a:graphicFrameLocks noChangeAspect="1"/>
+            </wp:cNvGraphicFramePr>
+            <a:graphic>
+              <a:graphicData uri="http://schemas.openxmlformats.org/drawingml/2006/picture">
+                <pic:pic>
+                  <pic:nvPicPr>
                     <pic:cNvPr id="0" name="06-settings.png"/>
                     <pic:cNvPicPr/>
                   </pic:nvPicPr>
                   <pic:blipFill>
-                    <a:blip r:embed="rId16"/>
+                    <a:blip r:embed="rId19"/>
                     <a:stretch>
                       <a:fillRect/>
                     </a:stretch>
@@ -6073,7 +6821,7 @@
         <w:drawing>
           <wp:inline xmlns:a="http://schemas.openxmlformats.org/drawingml/2006/main" xmlns:pic="http://schemas.openxmlformats.org/drawingml/2006/picture">
             <wp:extent cx="5472000" cy="3588197"/>
-            <wp:docPr id="9" name="Picture 9"/>
+            <wp:docPr id="12" name="Picture 12"/>
             <wp:cNvGraphicFramePr>
               <a:graphicFrameLocks noChangeAspect="1"/>
             </wp:cNvGraphicFramePr>
@@ -6085,7 +6833,7 @@
                     <pic:cNvPicPr/>
                   </pic:nvPicPr>
                   <pic:blipFill>
-                    <a:blip r:embed="rId17"/>
+                    <a:blip r:embed="rId20"/>
                     <a:stretch>
                       <a:fillRect/>
                     </a:stretch>
@@ -6325,7 +7073,7 @@
                 <w:b w:val="0"/>
                 <w:sz w:val="19"/>
               </w:rPr>
-              <w:t>当前程序版本（Gurutu + 打包时刻）与构建时间</w:t>
+              <w:t>当前程序版本（Ver. + 打包时刻）与构建时间</w:t>
             </w:r>
           </w:p>
         </w:tc>
@@ -6369,6 +7117,178 @@
                 <w:sz w:val="19"/>
               </w:rPr>
               <w:t>配置、缓存、日志所在路径</w:t>
+            </w:r>
+          </w:p>
+        </w:tc>
+      </w:tr>
+      <w:tr>
+        <w:trPr>
+          <w:cantSplit/>
+        </w:trPr>
+        <w:tc>
+          <w:tcPr>
+            <w:tcW w:type="dxa" w:w="2608"/>
+          </w:tcPr>
+          <w:p>
+            <w:pPr>
+              <w:spacing w:after="40"/>
+            </w:pPr>
+            <w:r/>
+            <w:r>
+              <w:rPr>
+                <w:rFonts w:ascii="Segoe UI" w:hAnsi="Segoe UI" w:eastAsia="微软雅黑"/>
+                <w:b w:val="0"/>
+                <w:sz w:val="19"/>
+              </w:rPr>
+              <w:t>配置文件</w:t>
+            </w:r>
+          </w:p>
+        </w:tc>
+        <w:tc>
+          <w:tcPr>
+            <w:tcW w:type="dxa" w:w="6009"/>
+          </w:tcPr>
+          <w:p>
+            <w:pPr>
+              <w:spacing w:after="40"/>
+            </w:pPr>
+            <w:r/>
+            <w:r>
+              <w:rPr>
+                <w:rFonts w:ascii="Segoe UI" w:hAnsi="Segoe UI" w:eastAsia="微软雅黑"/>
+                <w:b w:val="0"/>
+                <w:sz w:val="19"/>
+              </w:rPr>
+              <w:t>当前生效配置的完整路径；标注「内嵌出厂配置」表示本程序已内置出厂设置，标注「便携降级模式」表示程序目录不可写、配置已转存到系统目录</w:t>
+            </w:r>
+          </w:p>
+        </w:tc>
+      </w:tr>
+      <w:tr>
+        <w:trPr>
+          <w:cantSplit/>
+        </w:trPr>
+        <w:tc>
+          <w:tcPr>
+            <w:tcW w:type="dxa" w:w="2608"/>
+          </w:tcPr>
+          <w:p>
+            <w:pPr>
+              <w:spacing w:after="40"/>
+            </w:pPr>
+            <w:r/>
+            <w:r>
+              <w:rPr>
+                <w:rFonts w:ascii="Segoe UI" w:hAnsi="Segoe UI" w:eastAsia="微软雅黑"/>
+                <w:b w:val="0"/>
+                <w:sz w:val="19"/>
+              </w:rPr>
+              <w:t>导出配置</w:t>
+            </w:r>
+          </w:p>
+        </w:tc>
+        <w:tc>
+          <w:tcPr>
+            <w:tcW w:type="dxa" w:w="6009"/>
+          </w:tcPr>
+          <w:p>
+            <w:pPr>
+              <w:spacing w:after="40"/>
+            </w:pPr>
+            <w:r/>
+            <w:r>
+              <w:rPr>
+                <w:rFonts w:ascii="Segoe UI" w:hAnsi="Segoe UI" w:eastAsia="微软雅黑"/>
+                <w:b w:val="0"/>
+                <w:sz w:val="19"/>
+              </w:rPr>
+              <w:t>把当前配置另存为随身 JSON，用于备份或迁移到其他机器</w:t>
+            </w:r>
+          </w:p>
+        </w:tc>
+      </w:tr>
+      <w:tr>
+        <w:trPr>
+          <w:cantSplit/>
+        </w:trPr>
+        <w:tc>
+          <w:tcPr>
+            <w:tcW w:type="dxa" w:w="2608"/>
+          </w:tcPr>
+          <w:p>
+            <w:pPr>
+              <w:spacing w:after="40"/>
+            </w:pPr>
+            <w:r/>
+            <w:r>
+              <w:rPr>
+                <w:rFonts w:ascii="Segoe UI" w:hAnsi="Segoe UI" w:eastAsia="微软雅黑"/>
+                <w:b w:val="0"/>
+                <w:sz w:val="19"/>
+              </w:rPr>
+              <w:t>导入配置</w:t>
+            </w:r>
+          </w:p>
+        </w:tc>
+        <w:tc>
+          <w:tcPr>
+            <w:tcW w:type="dxa" w:w="6009"/>
+          </w:tcPr>
+          <w:p>
+            <w:pPr>
+              <w:spacing w:after="40"/>
+            </w:pPr>
+            <w:r/>
+            <w:r>
+              <w:rPr>
+                <w:rFonts w:ascii="Segoe UI" w:hAnsi="Segoe UI" w:eastAsia="微软雅黑"/>
+                <w:b w:val="0"/>
+                <w:sz w:val="19"/>
+              </w:rPr>
+              <w:t>从之前导出的 JSON 恢复配置，导入后立即刷新界面</w:t>
+            </w:r>
+          </w:p>
+        </w:tc>
+      </w:tr>
+      <w:tr>
+        <w:trPr>
+          <w:cantSplit/>
+        </w:trPr>
+        <w:tc>
+          <w:tcPr>
+            <w:tcW w:type="dxa" w:w="2608"/>
+          </w:tcPr>
+          <w:p>
+            <w:pPr>
+              <w:spacing w:after="40"/>
+            </w:pPr>
+            <w:r/>
+            <w:r>
+              <w:rPr>
+                <w:rFonts w:ascii="Segoe UI" w:hAnsi="Segoe UI" w:eastAsia="微软雅黑"/>
+                <w:b w:val="0"/>
+                <w:sz w:val="19"/>
+              </w:rPr>
+              <w:t>固化为出厂默认</w:t>
+            </w:r>
+          </w:p>
+        </w:tc>
+        <w:tc>
+          <w:tcPr>
+            <w:tcW w:type="dxa" w:w="6009"/>
+          </w:tcPr>
+          <w:p>
+            <w:pPr>
+              <w:spacing w:after="40"/>
+            </w:pPr>
+            <w:r/>
+            <w:r>
+              <w:rPr>
+                <w:rFonts w:ascii="Segoe UI" w:hAnsi="Segoe UI" w:eastAsia="微软雅黑"/>
+                <w:b w:val="0"/>
+                <w:sz w:val="19"/>
+              </w:rPr>
+              <w:t>把当前配置（含本机加密的 API Key）写入软件目录的「出厂配置.json」，随软件文件夹一起迁移。程序目录不可写时会提示失败</w:t>
             </w:r>
           </w:p>
         </w:tc>
@@ -6510,6 +7430,61 @@
     </w:p>
     <w:p>
       <w:pPr>
+        <w:spacing w:before="120" w:after="40"/>
+        <w:jc w:val="center"/>
+      </w:pPr>
+      <w:r>
+        <w:drawing>
+          <wp:inline xmlns:a="http://schemas.openxmlformats.org/drawingml/2006/main" xmlns:pic="http://schemas.openxmlformats.org/drawingml/2006/picture">
+            <wp:extent cx="5472000" cy="3588197"/>
+            <wp:docPr id="13" name="Picture 13"/>
+            <wp:cNvGraphicFramePr>
+              <a:graphicFrameLocks noChangeAspect="1"/>
+            </wp:cNvGraphicFramePr>
+            <a:graphic>
+              <a:graphicData uri="http://schemas.openxmlformats.org/drawingml/2006/picture">
+                <pic:pic>
+                  <pic:nvPicPr>
+                    <pic:cNvPr id="0" name="13-settings-config.png"/>
+                    <pic:cNvPicPr/>
+                  </pic:nvPicPr>
+                  <pic:blipFill>
+                    <a:blip r:embed="rId21"/>
+                    <a:stretch>
+                      <a:fillRect/>
+                    </a:stretch>
+                  </pic:blipFill>
+                  <pic:spPr>
+                    <a:xfrm>
+                      <a:off x="0" y="0"/>
+                      <a:ext cx="5472000" cy="3588197"/>
+                    </a:xfrm>
+                    <a:prstGeom prst="rect"/>
+                  </pic:spPr>
+                </pic:pic>
+              </a:graphicData>
+            </a:graphic>
+          </wp:inline>
+        </w:drawing>
+      </w:r>
+    </w:p>
+    <w:p>
+      <w:pPr>
+        <w:spacing w:after="200"/>
+        <w:jc w:val="center"/>
+      </w:pPr>
+      <w:r>
+        <w:rPr>
+          <w:rFonts w:ascii="Segoe UI" w:hAnsi="Segoe UI" w:eastAsia="微软雅黑"/>
+          <w:b w:val="0"/>
+          <w:color w:val="6B7280"/>
+          <w:sz w:val="18"/>
+        </w:rPr>
+        <w:t>图 8-3  设置页：缓存与运行（配置导出、导入、固化与文件位置）</w:t>
+      </w:r>
+    </w:p>
+    <w:p>
+      <w:pPr>
         <w:spacing w:before="320" w:after="160"/>
         <w:pBdr>
           <w:bottom w:val="single" w:sz="6" w:space="4" w:color="1F66D8"/>
@@ -6648,7 +7623,7 @@
           <w:b w:val="0"/>
           <w:sz w:val="19"/>
         </w:rPr>
-        <w:t>data\settings.json　配置（含加密后的 API Key）</w:t>
+        <w:t>data\settings.json　　配置（含加密后的 API Key）</w:t>
       </w:r>
     </w:p>
     <w:p>
@@ -6661,7 +7636,7 @@
           <w:b w:val="0"/>
           <w:sz w:val="19"/>
         </w:rPr>
-        <w:t>data\tm.db　　　　　翻译记忆缓存</w:t>
+        <w:t>data\tm.db　　　　　　翻译记忆缓存</w:t>
       </w:r>
     </w:p>
     <w:p>
@@ -6674,7 +7649,7 @@
           <w:b w:val="0"/>
           <w:sz w:val="19"/>
         </w:rPr>
-        <w:t>data\terms.json　　　自建术语库</w:t>
+        <w:t>data\terms.json　　　　自建术语库</w:t>
       </w:r>
     </w:p>
     <w:p>
@@ -6687,12 +7662,12 @@
           <w:b w:val="0"/>
           <w:sz w:val="19"/>
         </w:rPr>
-        <w:t>data\logs\app.log　　运行日志</w:t>
+        <w:t>data\logs\app.log　　　运行日志</w:t>
       </w:r>
     </w:p>
     <w:p>
       <w:pPr>
-        <w:spacing w:after="200" w:line="360" w:lineRule="auto"/>
+        <w:spacing w:after="40" w:line="360" w:lineRule="auto"/>
       </w:pPr>
       <w:r>
         <w:rPr>
@@ -6700,7 +7675,20 @@
           <w:b w:val="0"/>
           <w:sz w:val="19"/>
         </w:rPr>
-        <w:t>output\　　　　　　 译文输出</w:t>
+        <w:t>出厂配置.json　　　　　便携出厂配置（点「固化为出厂默认」后生成，随软件迁移）</w:t>
+      </w:r>
+    </w:p>
+    <w:p>
+      <w:pPr>
+        <w:spacing w:after="200" w:line="360" w:lineRule="auto"/>
+      </w:pPr>
+      <w:r>
+        <w:rPr>
+          <w:rFonts w:ascii="Consolas" w:hAnsi="Consolas" w:eastAsia="微软雅黑"/>
+          <w:b w:val="0"/>
+          <w:sz w:val="19"/>
+        </w:rPr>
+        <w:t>output\　　　　　　　译文输出</w:t>
       </w:r>
     </w:p>
     <w:p>
@@ -6714,7 +7702,475 @@
           <w:b/>
           <w:sz w:val="25"/>
         </w:rPr>
-        <w:t>10.2  备份与迁移</w:t>
+        <w:t>10.2  配置随软件分发</w:t>
+      </w:r>
+    </w:p>
+    <w:p>
+      <w:pPr>
+        <w:spacing w:after="120" w:line="360" w:lineRule="auto"/>
+      </w:pPr>
+      <w:r>
+        <w:rPr>
+          <w:rFonts w:ascii="Segoe UI" w:hAnsi="Segoe UI" w:eastAsia="微软雅黑"/>
+          <w:b w:val="0"/>
+          <w:sz w:val="21"/>
+        </w:rPr>
+        <w:t>程序启动时按以下顺序确定配置，后者覆盖前者：</w:t>
+      </w:r>
+    </w:p>
+    <w:tbl>
+      <w:tblPr>
+        <w:tblStyle w:val="TableGrid"/>
+        <w:tblW w:type="auto" w:w="0"/>
+        <w:jc w:val="center"/>
+        <w:tblLayout w:type="fixed"/>
+        <w:tblLook w:firstColumn="1" w:firstRow="1" w:lastColumn="0" w:lastRow="0" w:noHBand="0" w:noVBand="1" w:val="04A0"/>
+      </w:tblPr>
+      <w:tblGrid>
+        <w:gridCol w:w="1474"/>
+        <w:gridCol w:w="2494"/>
+        <w:gridCol w:w="4649"/>
+      </w:tblGrid>
+      <w:tr>
+        <w:tc>
+          <w:tcPr>
+            <w:tcW w:type="dxa" w:w="1474"/>
+            <w:shd w:fill="EEF3FB"/>
+          </w:tcPr>
+          <w:p>
+            <w:pPr>
+              <w:keepNext/>
+              <w:spacing w:after="40"/>
+            </w:pPr>
+            <w:r/>
+            <w:r>
+              <w:rPr>
+                <w:rFonts w:ascii="Segoe UI" w:hAnsi="Segoe UI" w:eastAsia="微软雅黑"/>
+                <w:b/>
+                <w:sz w:val="19"/>
+              </w:rPr>
+              <w:t>优先级</w:t>
+            </w:r>
+          </w:p>
+        </w:tc>
+        <w:tc>
+          <w:tcPr>
+            <w:tcW w:type="dxa" w:w="2494"/>
+            <w:shd w:fill="EEF3FB"/>
+          </w:tcPr>
+          <w:p>
+            <w:pPr>
+              <w:keepNext/>
+              <w:spacing w:after="40"/>
+            </w:pPr>
+            <w:r/>
+            <w:r>
+              <w:rPr>
+                <w:rFonts w:ascii="Segoe UI" w:hAnsi="Segoe UI" w:eastAsia="微软雅黑"/>
+                <w:b/>
+                <w:sz w:val="19"/>
+              </w:rPr>
+              <w:t>来源</w:t>
+            </w:r>
+          </w:p>
+        </w:tc>
+        <w:tc>
+          <w:tcPr>
+            <w:tcW w:type="dxa" w:w="4649"/>
+            <w:shd w:fill="EEF3FB"/>
+          </w:tcPr>
+          <w:p>
+            <w:pPr>
+              <w:keepNext/>
+              <w:spacing w:after="40"/>
+            </w:pPr>
+            <w:r/>
+            <w:r>
+              <w:rPr>
+                <w:rFonts w:ascii="Segoe UI" w:hAnsi="Segoe UI" w:eastAsia="微软雅黑"/>
+                <w:b/>
+                <w:sz w:val="19"/>
+              </w:rPr>
+              <w:t>说明</w:t>
+            </w:r>
+          </w:p>
+        </w:tc>
+      </w:tr>
+      <w:tr>
+        <w:trPr>
+          <w:cantSplit/>
+        </w:trPr>
+        <w:tc>
+          <w:tcPr>
+            <w:tcW w:type="dxa" w:w="1474"/>
+          </w:tcPr>
+          <w:p>
+            <w:pPr>
+              <w:spacing w:after="40"/>
+            </w:pPr>
+            <w:r/>
+            <w:r>
+              <w:rPr>
+                <w:rFonts w:ascii="Segoe UI" w:hAnsi="Segoe UI" w:eastAsia="微软雅黑"/>
+                <w:b w:val="0"/>
+                <w:sz w:val="19"/>
+              </w:rPr>
+              <w:t>1（最低）</w:t>
+            </w:r>
+          </w:p>
+        </w:tc>
+        <w:tc>
+          <w:tcPr>
+            <w:tcW w:type="dxa" w:w="2494"/>
+          </w:tcPr>
+          <w:p>
+            <w:pPr>
+              <w:spacing w:after="40"/>
+            </w:pPr>
+            <w:r/>
+            <w:r>
+              <w:rPr>
+                <w:rFonts w:ascii="Segoe UI" w:hAnsi="Segoe UI" w:eastAsia="微软雅黑"/>
+                <w:b w:val="0"/>
+                <w:sz w:val="19"/>
+              </w:rPr>
+              <w:t>内置默认值</w:t>
+            </w:r>
+          </w:p>
+        </w:tc>
+        <w:tc>
+          <w:tcPr>
+            <w:tcW w:type="dxa" w:w="4649"/>
+          </w:tcPr>
+          <w:p>
+            <w:pPr>
+              <w:spacing w:after="40"/>
+            </w:pPr>
+            <w:r/>
+            <w:r>
+              <w:rPr>
+                <w:rFonts w:ascii="Segoe UI" w:hAnsi="Segoe UI" w:eastAsia="微软雅黑"/>
+                <w:b w:val="0"/>
+                <w:sz w:val="19"/>
+              </w:rPr>
+              <w:t>程序内置的出厂参数</w:t>
+            </w:r>
+          </w:p>
+        </w:tc>
+      </w:tr>
+      <w:tr>
+        <w:trPr>
+          <w:cantSplit/>
+        </w:trPr>
+        <w:tc>
+          <w:tcPr>
+            <w:tcW w:type="dxa" w:w="1474"/>
+          </w:tcPr>
+          <w:p>
+            <w:pPr>
+              <w:spacing w:after="40"/>
+            </w:pPr>
+            <w:r/>
+            <w:r>
+              <w:rPr>
+                <w:rFonts w:ascii="Segoe UI" w:hAnsi="Segoe UI" w:eastAsia="微软雅黑"/>
+                <w:b w:val="0"/>
+                <w:sz w:val="19"/>
+              </w:rPr>
+              <w:t>2</w:t>
+            </w:r>
+          </w:p>
+        </w:tc>
+        <w:tc>
+          <w:tcPr>
+            <w:tcW w:type="dxa" w:w="2494"/>
+          </w:tcPr>
+          <w:p>
+            <w:pPr>
+              <w:spacing w:after="40"/>
+            </w:pPr>
+            <w:r/>
+            <w:r>
+              <w:rPr>
+                <w:rFonts w:ascii="Segoe UI" w:hAnsi="Segoe UI" w:eastAsia="微软雅黑"/>
+                <w:b w:val="0"/>
+                <w:sz w:val="19"/>
+              </w:rPr>
+              <w:t>内嵌出厂配置</w:t>
+            </w:r>
+          </w:p>
+        </w:tc>
+        <w:tc>
+          <w:tcPr>
+            <w:tcW w:type="dxa" w:w="4649"/>
+          </w:tcPr>
+          <w:p>
+            <w:pPr>
+              <w:spacing w:after="40"/>
+            </w:pPr>
+            <w:r/>
+            <w:r>
+              <w:rPr>
+                <w:rFonts w:ascii="Segoe UI" w:hAnsi="Segoe UI" w:eastAsia="微软雅黑"/>
+                <w:b w:val="0"/>
+                <w:sz w:val="19"/>
+              </w:rPr>
+              <w:t>打包时烧入 EXE 的设置，新机器首次打开即为配置好的状态</w:t>
+            </w:r>
+          </w:p>
+        </w:tc>
+      </w:tr>
+      <w:tr>
+        <w:trPr>
+          <w:cantSplit/>
+        </w:trPr>
+        <w:tc>
+          <w:tcPr>
+            <w:tcW w:type="dxa" w:w="1474"/>
+          </w:tcPr>
+          <w:p>
+            <w:pPr>
+              <w:spacing w:after="40"/>
+            </w:pPr>
+            <w:r/>
+            <w:r>
+              <w:rPr>
+                <w:rFonts w:ascii="Segoe UI" w:hAnsi="Segoe UI" w:eastAsia="微软雅黑"/>
+                <w:b w:val="0"/>
+                <w:sz w:val="19"/>
+              </w:rPr>
+              <w:t>3</w:t>
+            </w:r>
+          </w:p>
+        </w:tc>
+        <w:tc>
+          <w:tcPr>
+            <w:tcW w:type="dxa" w:w="2494"/>
+          </w:tcPr>
+          <w:p>
+            <w:pPr>
+              <w:spacing w:after="40"/>
+            </w:pPr>
+            <w:r/>
+            <w:r>
+              <w:rPr>
+                <w:rFonts w:ascii="Segoe UI" w:hAnsi="Segoe UI" w:eastAsia="微软雅黑"/>
+                <w:b w:val="0"/>
+                <w:sz w:val="19"/>
+              </w:rPr>
+              <w:t>出厂配置.json</w:t>
+            </w:r>
+          </w:p>
+        </w:tc>
+        <w:tc>
+          <w:tcPr>
+            <w:tcW w:type="dxa" w:w="4649"/>
+          </w:tcPr>
+          <w:p>
+            <w:pPr>
+              <w:spacing w:after="40"/>
+            </w:pPr>
+            <w:r/>
+            <w:r>
+              <w:rPr>
+                <w:rFonts w:ascii="Segoe UI" w:hAnsi="Segoe UI" w:eastAsia="微软雅黑"/>
+                <w:b w:val="0"/>
+                <w:sz w:val="19"/>
+              </w:rPr>
+              <w:t>位于软件目录，由「固化为出厂默认」生成，随文件夹迁移</w:t>
+            </w:r>
+          </w:p>
+        </w:tc>
+      </w:tr>
+      <w:tr>
+        <w:trPr>
+          <w:cantSplit/>
+        </w:trPr>
+        <w:tc>
+          <w:tcPr>
+            <w:tcW w:type="dxa" w:w="1474"/>
+          </w:tcPr>
+          <w:p>
+            <w:pPr>
+              <w:spacing w:after="40"/>
+            </w:pPr>
+            <w:r/>
+            <w:r>
+              <w:rPr>
+                <w:rFonts w:ascii="Segoe UI" w:hAnsi="Segoe UI" w:eastAsia="微软雅黑"/>
+                <w:b w:val="0"/>
+                <w:sz w:val="19"/>
+              </w:rPr>
+              <w:t>4（最高）</w:t>
+            </w:r>
+          </w:p>
+        </w:tc>
+        <w:tc>
+          <w:tcPr>
+            <w:tcW w:type="dxa" w:w="2494"/>
+          </w:tcPr>
+          <w:p>
+            <w:pPr>
+              <w:spacing w:after="40"/>
+            </w:pPr>
+            <w:r/>
+            <w:r>
+              <w:rPr>
+                <w:rFonts w:ascii="Segoe UI" w:hAnsi="Segoe UI" w:eastAsia="微软雅黑"/>
+                <w:b w:val="0"/>
+                <w:sz w:val="19"/>
+              </w:rPr>
+              <w:t>data\settings.json</w:t>
+            </w:r>
+          </w:p>
+        </w:tc>
+        <w:tc>
+          <w:tcPr>
+            <w:tcW w:type="dxa" w:w="4649"/>
+          </w:tcPr>
+          <w:p>
+            <w:pPr>
+              <w:spacing w:after="40"/>
+            </w:pPr>
+            <w:r/>
+            <w:r>
+              <w:rPr>
+                <w:rFonts w:ascii="Segoe UI" w:hAnsi="Segoe UI" w:eastAsia="微软雅黑"/>
+                <w:b w:val="0"/>
+                <w:sz w:val="19"/>
+              </w:rPr>
+              <w:t>用户在本机的实际配置</w:t>
+            </w:r>
+          </w:p>
+        </w:tc>
+      </w:tr>
+    </w:tbl>
+    <w:p>
+      <w:pPr>
+        <w:spacing w:after="40"/>
+      </w:pPr>
+    </w:p>
+    <w:p>
+      <w:pPr>
+        <w:spacing w:after="120" w:line="360" w:lineRule="auto"/>
+      </w:pPr>
+      <w:r>
+        <w:rPr>
+          <w:rFonts w:ascii="Segoe UI" w:hAnsi="Segoe UI" w:eastAsia="微软雅黑"/>
+          <w:b w:val="0"/>
+          <w:sz w:val="21"/>
+        </w:rPr>
+        <w:t>要让配置跟着软件走，有两种方式：</w:t>
+      </w:r>
+    </w:p>
+    <w:p>
+      <w:pPr>
+        <w:spacing w:after="60" w:line="348" w:lineRule="auto"/>
+        <w:ind w:left="482" w:hanging="482"/>
+      </w:pPr>
+      <w:r>
+        <w:rPr>
+          <w:rFonts w:ascii="Segoe UI" w:hAnsi="Segoe UI" w:eastAsia="微软雅黑"/>
+          <w:b/>
+          <w:sz w:val="21"/>
+        </w:rPr>
+        <w:t xml:space="preserve">1. </w:t>
+      </w:r>
+      <w:r>
+        <w:rPr>
+          <w:rFonts w:ascii="Segoe UI" w:hAnsi="Segoe UI" w:eastAsia="微软雅黑"/>
+          <w:b w:val="0"/>
+          <w:sz w:val="21"/>
+        </w:rPr>
+        <w:t>迁移整个文件夹：把软件目录（含 data 与 output）整体拷贝到新机器或 U 盘。</w:t>
+      </w:r>
+    </w:p>
+    <w:p>
+      <w:pPr>
+        <w:spacing w:after="60" w:line="348" w:lineRule="auto"/>
+        <w:ind w:left="482" w:hanging="482"/>
+      </w:pPr>
+      <w:r>
+        <w:rPr>
+          <w:rFonts w:ascii="Segoe UI" w:hAnsi="Segoe UI" w:eastAsia="微软雅黑"/>
+          <w:b/>
+          <w:sz w:val="21"/>
+        </w:rPr>
+        <w:t xml:space="preserve">2. </w:t>
+      </w:r>
+      <w:r>
+        <w:rPr>
+          <w:rFonts w:ascii="Segoe UI" w:hAnsi="Segoe UI" w:eastAsia="微软雅黑"/>
+          <w:b w:val="0"/>
+          <w:sz w:val="21"/>
+        </w:rPr>
+        <w:t>先固化再迁移：在设置页配置好并保存，点「固化为出厂默认」，之后即使不带 data 目录，只拷 EXE 与「出厂配置.json」也能恢复配置。</w:t>
+      </w:r>
+    </w:p>
+    <w:p>
+      <w:pPr>
+        <w:spacing w:before="80" w:after="160" w:line="348" w:lineRule="auto"/>
+        <w:ind w:left="170"/>
+        <w:pBdr>
+          <w:left w:val="single" w:sz="18" w:space="8" w:color="1F66D8"/>
+        </w:pBdr>
+      </w:pPr>
+      <w:r>
+        <w:rPr>
+          <w:rFonts w:ascii="Segoe UI" w:hAnsi="Segoe UI" w:eastAsia="微软雅黑"/>
+          <w:b/>
+          <w:color w:val="1F66D8"/>
+          <w:sz w:val="20"/>
+        </w:rPr>
+        <w:t>【原理】</w:t>
+      </w:r>
+      <w:r>
+        <w:rPr>
+          <w:rFonts w:ascii="Segoe UI" w:hAnsi="Segoe UI" w:eastAsia="微软雅黑"/>
+          <w:b w:val="0"/>
+          <w:sz w:val="20"/>
+        </w:rPr>
+        <w:t>Windows 不允许运行中的程序改写自身 EXE，因此「配置固化进软件」以软件目录下的「出厂配置.json」实现——效果等同，且随时可以重新固化。</w:t>
+      </w:r>
+    </w:p>
+    <w:p>
+      <w:pPr>
+        <w:spacing w:before="80" w:after="160" w:line="348" w:lineRule="auto"/>
+        <w:ind w:left="170"/>
+        <w:pBdr>
+          <w:left w:val="single" w:sz="18" w:space="8" w:color="1F66D8"/>
+        </w:pBdr>
+      </w:pPr>
+      <w:r>
+        <w:rPr>
+          <w:rFonts w:ascii="Segoe UI" w:hAnsi="Segoe UI" w:eastAsia="微软雅黑"/>
+          <w:b/>
+          <w:color w:val="1F66D8"/>
+          <w:sz w:val="20"/>
+        </w:rPr>
+        <w:t>【注意】</w:t>
+      </w:r>
+      <w:r>
+        <w:rPr>
+          <w:rFonts w:ascii="Segoe UI" w:hAnsi="Segoe UI" w:eastAsia="微软雅黑"/>
+          <w:b w:val="0"/>
+          <w:sz w:val="20"/>
+        </w:rPr>
+        <w:t>API Key 使用 Windows DPAPI 加密且绑定本机账户：本机固化后可直接使用；换电脑会解密失败，届时在设置页重新填写一次即可。</w:t>
+      </w:r>
+    </w:p>
+    <w:p>
+      <w:pPr>
+        <w:keepNext/>
+        <w:spacing w:before="240" w:after="100"/>
+      </w:pPr>
+      <w:r>
+        <w:rPr>
+          <w:rFonts w:ascii="Segoe UI" w:hAnsi="Segoe UI" w:eastAsia="微软雅黑"/>
+          <w:b/>
+          <w:sz w:val="25"/>
+        </w:rPr>
+        <w:t>10.3  备份与迁移</w:t>
       </w:r>
     </w:p>
     <w:p>
@@ -6732,6 +8188,19 @@
     </w:p>
     <w:p>
       <w:pPr>
+        <w:spacing w:after="120" w:line="360" w:lineRule="auto"/>
+      </w:pPr>
+      <w:r>
+        <w:rPr>
+          <w:rFonts w:ascii="Segoe UI" w:hAnsi="Segoe UI" w:eastAsia="微软雅黑"/>
+          <w:b w:val="0"/>
+          <w:sz w:val="21"/>
+        </w:rPr>
+        <w:t>输出目录按「相对程序目录」的方式保存，因此把软件整体移到别的盘符或电脑后，输出目录会自动指向新位置的 output，无需重新设置。</w:t>
+      </w:r>
+    </w:p>
+    <w:p>
+      <w:pPr>
         <w:keepNext/>
         <w:spacing w:before="240" w:after="100"/>
       </w:pPr>
@@ -6741,7 +8210,7 @@
           <w:b/>
           <w:sz w:val="25"/>
         </w:rPr>
-        <w:t>10.3  关键配置项</w:t>
+        <w:t>10.4  关键配置项</w:t>
       </w:r>
     </w:p>
     <w:tbl>
@@ -6948,7 +8417,7 @@
                 <w:b w:val="0"/>
                 <w:sz w:val="19"/>
               </w:rPr>
-              <w:t>output.dir / suffix / auto_save</w:t>
+              <w:t>output.dir / suffix / auto_save / translate_name</w:t>
             </w:r>
           </w:p>
         </w:tc>
@@ -6967,7 +8436,50 @@
                 <w:b w:val="0"/>
                 <w:sz w:val="19"/>
               </w:rPr>
-              <w:t>输出目录、后缀、自动写盘</w:t>
+              <w:t>输出目录（相对程序目录存储）、文件名后缀、自动写盘、是否翻译文件名</w:t>
+            </w:r>
+          </w:p>
+        </w:tc>
+      </w:tr>
+      <w:tr>
+        <w:trPr>
+          <w:cantSplit/>
+        </w:trPr>
+        <w:tc>
+          <w:tcPr>
+            <w:tcW w:type="dxa" w:w="3402"/>
+          </w:tcPr>
+          <w:p>
+            <w:pPr>
+              <w:spacing w:after="40"/>
+            </w:pPr>
+            <w:r/>
+            <w:r>
+              <w:rPr>
+                <w:rFonts w:ascii="Segoe UI" w:hAnsi="Segoe UI" w:eastAsia="微软雅黑"/>
+                <w:b w:val="0"/>
+                <w:sz w:val="19"/>
+              </w:rPr>
+              <w:t>preview.fx / font / dist</w:t>
+            </w:r>
+          </w:p>
+        </w:tc>
+        <w:tc>
+          <w:tcPr>
+            <w:tcW w:type="dxa" w:w="5216"/>
+          </w:tcPr>
+          <w:p>
+            <w:pPr>
+              <w:spacing w:after="40"/>
+            </w:pPr>
+            <w:r/>
+            <w:r>
+              <w:rPr>
+                <w:rFonts w:ascii="Segoe UI" w:hAnsi="Segoe UI" w:eastAsia="微软雅黑"/>
+                <w:b w:val="0"/>
+                <w:sz w:val="19"/>
+              </w:rPr>
+              <w:t>全文预览的显示效果、译文字体、分布方式</w:t>
             </w:r>
           </w:p>
         </w:tc>
@@ -7316,6 +8828,146 @@
           <w:sz w:val="21"/>
         </w:rPr>
         <w:t>A：不能。当前版本无 OCR，扫描件（无文字层）会提示未找到可翻译文字。</w:t>
+      </w:r>
+    </w:p>
+    <w:p>
+      <w:pPr>
+        <w:keepNext/>
+        <w:spacing w:before="160" w:after="60"/>
+      </w:pPr>
+      <w:r>
+        <w:rPr>
+          <w:rFonts w:ascii="Segoe UI" w:hAnsi="Segoe UI" w:eastAsia="微软雅黑"/>
+          <w:b/>
+          <w:color w:val="333A45"/>
+          <w:sz w:val="22"/>
+        </w:rPr>
+        <w:t>Q：提示「写回失败 PermissionError」怎么办？</w:t>
+      </w:r>
+    </w:p>
+    <w:p>
+      <w:pPr>
+        <w:spacing w:after="160" w:line="360" w:lineRule="auto"/>
+      </w:pPr>
+      <w:r>
+        <w:rPr>
+          <w:rFonts w:ascii="Segoe UI" w:hAnsi="Segoe UI" w:eastAsia="微软雅黑"/>
+          <w:b w:val="0"/>
+          <w:sz w:val="21"/>
+        </w:rPr>
+        <w:t>A：翻译本身已完成，只是保存译文时被系统拒绝——多半是输出目录指向了 Program Files 等受保护位置。把输出目录改到普通可写目录即可；新版本会自动转存并在任务警告中提示实际保存位置。</w:t>
+      </w:r>
+    </w:p>
+    <w:p>
+      <w:pPr>
+        <w:keepNext/>
+        <w:spacing w:before="160" w:after="60"/>
+      </w:pPr>
+      <w:r>
+        <w:rPr>
+          <w:rFonts w:ascii="Segoe UI" w:hAnsi="Segoe UI" w:eastAsia="微软雅黑"/>
+          <w:b/>
+          <w:color w:val="333A45"/>
+          <w:sz w:val="22"/>
+        </w:rPr>
+        <w:t>Q：启动时报「Access is denied: ...\data」？</w:t>
+      </w:r>
+    </w:p>
+    <w:p>
+      <w:pPr>
+        <w:spacing w:after="160" w:line="360" w:lineRule="auto"/>
+      </w:pPr>
+      <w:r>
+        <w:rPr>
+          <w:rFonts w:ascii="Segoe UI" w:hAnsi="Segoe UI" w:eastAsia="微软雅黑"/>
+          <w:b w:val="0"/>
+          <w:sz w:val="21"/>
+        </w:rPr>
+        <w:t>A：程序目录不可写。请把整个软件文件夹移到普通目录（如 D:\Gururu 翻译），或以管理员身份运行一次；新版本会自动降级到 %LOCALAPPDATA%\Gururu 翻译 而不崩溃。</w:t>
+      </w:r>
+    </w:p>
+    <w:p>
+      <w:pPr>
+        <w:keepNext/>
+        <w:spacing w:before="160" w:after="60"/>
+      </w:pPr>
+      <w:r>
+        <w:rPr>
+          <w:rFonts w:ascii="Segoe UI" w:hAnsi="Segoe UI" w:eastAsia="微软雅黑"/>
+          <w:b/>
+          <w:color w:val="333A45"/>
+          <w:sz w:val="22"/>
+        </w:rPr>
+        <w:t>Q：换电脑后配置还在吗？</w:t>
+      </w:r>
+    </w:p>
+    <w:p>
+      <w:pPr>
+        <w:spacing w:after="160" w:line="360" w:lineRule="auto"/>
+      </w:pPr>
+      <w:r>
+        <w:rPr>
+          <w:rFonts w:ascii="Segoe UI" w:hAnsi="Segoe UI" w:eastAsia="微软雅黑"/>
+          <w:b w:val="0"/>
+          <w:sz w:val="21"/>
+        </w:rPr>
+        <w:t>A：在。要么整个软件文件夹一起拷贝，要么先在原机器点「固化为出厂默认」再拷贝 EXE 与「出厂配置.json」。注意 API Key 为 DPAPI 本机加密，换机后需在设置页重新填写。</w:t>
+      </w:r>
+    </w:p>
+    <w:p>
+      <w:pPr>
+        <w:keepNext/>
+        <w:spacing w:before="160" w:after="60"/>
+      </w:pPr>
+      <w:r>
+        <w:rPr>
+          <w:rFonts w:ascii="Segoe UI" w:hAnsi="Segoe UI" w:eastAsia="微软雅黑"/>
+          <w:b/>
+          <w:color w:val="333A45"/>
+          <w:sz w:val="22"/>
+        </w:rPr>
+        <w:t>Q：「固化为出厂默认」点了提示失败？</w:t>
+      </w:r>
+    </w:p>
+    <w:p>
+      <w:pPr>
+        <w:spacing w:after="160" w:line="360" w:lineRule="auto"/>
+      </w:pPr>
+      <w:r>
+        <w:rPr>
+          <w:rFonts w:ascii="Segoe UI" w:hAnsi="Segoe UI" w:eastAsia="微软雅黑"/>
+          <w:b w:val="0"/>
+          <w:sz w:val="21"/>
+        </w:rPr>
+        <w:t>A：说明程序目录不可写（常见于 Program Files）。把软件移到普通目录后重试即可。</w:t>
+      </w:r>
+    </w:p>
+    <w:p>
+      <w:pPr>
+        <w:keepNext/>
+        <w:spacing w:before="160" w:after="60"/>
+      </w:pPr>
+      <w:r>
+        <w:rPr>
+          <w:rFonts w:ascii="Segoe UI" w:hAnsi="Segoe UI" w:eastAsia="微软雅黑"/>
+          <w:b/>
+          <w:color w:val="333A45"/>
+          <w:sz w:val="22"/>
+        </w:rPr>
+        <w:t>Q：全文预览打开很慢？</w:t>
+      </w:r>
+    </w:p>
+    <w:p>
+      <w:pPr>
+        <w:spacing w:after="160" w:line="360" w:lineRule="auto"/>
+      </w:pPr>
+      <w:r>
+        <w:rPr>
+          <w:rFonts w:ascii="Segoe UI" w:hAnsi="Segoe UI" w:eastAsia="微软雅黑"/>
+          <w:b w:val="0"/>
+          <w:sz w:val="21"/>
+        </w:rPr>
+        <w:t>A：全文预览为一次性渲染全部段落，上千段的长文档会变慢。切回「逐段对照」即可流畅编辑。</w:t>
       </w:r>
     </w:p>
     <w:p>
@@ -8610,7 +10262,7 @@
           <w:b w:val="0"/>
           <w:sz w:val="21"/>
         </w:rPr>
-        <w:t>版本号格式为 Gurutu + 打包时刻（YYMMDDHHMM），例如 Gurutu2610292129 表示 2026-10-29 21:29 构建。可在【关于】窗口或设置 → 缓存与运行中查看。</w:t>
+        <w:t>版本号格式为 Ver. + 打包时刻（YYMMDDHHMM），例如 Ver.2610292129 表示 2026-10-29 21:29 构建。可在【关于】窗口或设置 → 缓存与运行中查看。</w:t>
       </w:r>
     </w:p>
     <w:p>
@@ -8629,7 +10281,7 @@
           <w:color w:val="6B7280"/>
           <w:sz w:val="19"/>
         </w:rPr>
-        <w:t>— 本手册对应 Gururu 翻译 Gurutu2610292129 —</w:t>
+        <w:t>— 本手册对应 Gururu 翻译 Ver.2610300122 —</w:t>
       </w:r>
     </w:p>
     <w:sectPr>

</xml_diff>